<commit_message>
feat: Bổ sung các chức năng quản lý xe, giải ngân, xuất kho và tạo tài liệu liên quan, bao gồm cả xác thực dữ liệu xe.
</commit_message>
<xml_diff>
--- a/src/main/resources/templates/GiaiNgan/duyet-ngan-hang.docx
+++ b/src/main/resources/templates/GiaiNgan/duyet-ngan-hang.docx
@@ -318,7 +318,13 @@
         <w:rPr>
           <w:sz w:val="24"/>
         </w:rPr>
-        <w:t>usedLimit}}</w:t>
+        <w:t>remainingLimit</w:t>
+      </w:r>
+      <w:r>
+        <w:rPr>
+          <w:sz w:val="24"/>
+        </w:rPr>
+        <w:t>}}</w:t>
       </w:r>
     </w:p>
     <w:p>
@@ -957,45 +963,18 @@
           <w:i/>
           <w:color w:val="156082" w:themeColor="accent1"/>
         </w:rPr>
-        <w:t>{{</w:t>
-      </w:r>
-      <w:r>
+        <w:t>{{CURRENT_DATE_TITLE}}</w:t>
+      </w:r>
+    </w:p>
+    <w:p>
+      <w:pPr>
+        <w:ind w:left="0" w:firstLine="0"/>
+        <w:jc w:val="right"/>
         <w:rPr>
           <w:i/>
           <w:color w:val="156082" w:themeColor="accent1"/>
         </w:rPr>
-        <w:t>CURRENT_DATE_</w:t>
-      </w:r>
-      <w:proofErr w:type="gramStart"/>
-      <w:r>
-        <w:rPr>
-          <w:i/>
-          <w:color w:val="156082" w:themeColor="accent1"/>
-        </w:rPr>
-        <w:t>TITLE</w:t>
-      </w:r>
-      <w:r>
-        <w:rPr>
-          <w:i/>
-          <w:color w:val="156082" w:themeColor="accent1"/>
-        </w:rPr>
-        <w:t xml:space="preserve"> </w:t>
-      </w:r>
-      <w:r>
-        <w:rPr>
-          <w:i/>
-          <w:color w:val="156082" w:themeColor="accent1"/>
-        </w:rPr>
-        <w:t>}</w:t>
-      </w:r>
-      <w:proofErr w:type="gramEnd"/>
-      <w:r>
-        <w:rPr>
-          <w:i/>
-          <w:color w:val="156082" w:themeColor="accent1"/>
-        </w:rPr>
-        <w:t>}</w:t>
-      </w:r>
+      </w:pPr>
     </w:p>
     <w:p>
       <w:pPr>

</xml_diff>